<commit_message>
Ressources numérotées sur les fiches (§1.3) et retour en haut des documents professeur
39 fiches portent leur bloc RESSOURCE n — nom, source, accès, adresse en clair —
lu dans le registre du site (src/data/ressources.ts) plutôt que recopié. Les
adresses écrites en dur dans le contenu de la séquence 01 sont retirées : elles
étaient une seconde source.

Deux fiches ont dû rendre de la place : S3-A01 4ème (situation resserrée,
avertissement fusionné, schéma à 370 pt) et les quatre fiches d'animation, dont
la partie 1 répétait l'adresse.

Co-Authored-By: Claude Opus 5 <noreply@anthropic.com>
</commit_message>
<xml_diff>
--- a/public/2026/seq01/FICHE_S1-A03_UniteCentrale_4eme.docx
+++ b/public/2026/seq01/FICHE_S1-A03_UniteCentrale_4eme.docx
@@ -514,6 +514,52 @@
     <w:p>
       <w:pPr>
         <w:keepNext/>
+        <w:pBdr>
+          <w:top w:val="single" w:sz="6" w:space="2" w:color="D9D9D9"/>
+          <w:left w:val="single" w:sz="6" w:space="2" w:color="D9D9D9"/>
+          <w:bottom w:val="single" w:sz="6" w:space="2" w:color="D9D9D9"/>
+          <w:right w:val="single" w:sz="6" w:space="2" w:color="D9D9D9"/>
+        </w:pBdr>
+        <w:shd w:val="clear" w:color="auto" w:fill="F2F2F2"/>
+        <w:spacing w:before="80" w:after="120"/>
+        <w:ind w:left="60" w:right="60"/>
+      </w:pPr>
+      <w:r>
+        <w:rPr>
+          <w:rFonts w:ascii="Arial" w:cs="Arial" w:eastAsia="Arial" w:hAnsi="Arial"/>
+          <w:b/>
+          <w:bCs/>
+          <w:sz w:val="24"/>
+          <w:szCs w:val="24"/>
+        </w:rPr>
+        <w:t xml:space="preserve">RESSOURCE 1 — L’unité centrale</w:t>
+      </w:r>
+      <w:r>
+        <w:rPr>
+          <w:rFonts w:ascii="Arial" w:cs="Arial" w:eastAsia="Arial" w:hAnsi="Arial"/>
+          <w:sz w:val="24"/>
+          <w:szCs w:val="24"/>
+        </w:rPr>
+        <w:t xml:space="preserve"> · Techno-Flash · rien à installer</w:t>
+      </w:r>
+      <w:r>
+        <w:rPr>
+          <w:rFonts w:ascii="Arial" w:cs="Arial" w:eastAsia="Arial" w:hAnsi="Arial"/>
+        </w:rPr>
+        <w:br/>
+      </w:r>
+      <w:r>
+        <w:rPr>
+          <w:rFonts w:ascii="Arial" w:cs="Arial" w:eastAsia="Arial" w:hAnsi="Arial"/>
+          <w:sz w:val="22"/>
+          <w:szCs w:val="22"/>
+        </w:rPr>
+        <w:t xml:space="preserve">→ techno-flash.com/animations/unicenligne/unite_centrale.html</w:t>
+      </w:r>
+    </w:p>
+    <w:p>
+      <w:pPr>
+        <w:keepNext/>
         <w:keepLines/>
         <w:pBdr>
           <w:top w:val="single" w:color="000000" w:sz="6" w:space="4"/>
@@ -554,24 +600,7 @@
           <w:sz w:val="24"/>
           <w:szCs w:val="24"/>
         </w:rPr>
-        <w:t xml:space="preserve">➤ Ouvre l'adresse ci-dessous, puis coche chaque case quand tu as fait ce qui est écrit.</w:t>
-      </w:r>
-    </w:p>
-    <w:p>
-      <w:pPr>
-        <w:spacing w:after="48" w:before="50"/>
-      </w:pPr>
-      <w:r>
-        <w:rPr>
-          <w:rFonts w:ascii="Arial" w:cs="Arial" w:eastAsia="Arial" w:hAnsi="Arial"/>
-          <w:b/>
-          <w:bCs/>
-          <w:i w:val="false"/>
-          <w:iCs w:val="false"/>
-          <w:sz w:val="24"/>
-          <w:szCs w:val="24"/>
-        </w:rPr>
-        <w:t xml:space="preserve">techno-flash.com/animations/unicenligne/unite_centrale.html</w:t>
+        <w:t xml:space="preserve">➤ Ouvre l'adresse de la RESSOURCE 1 (en haut de la fiche), puis coche chaque case.</w:t>
       </w:r>
     </w:p>
     <w:p>

</xml_diff>